<commit_message>
Update downloadable resume with current Vdart role
The resume served by the Download Resume button still listed Invision
as the current position. Updated:

- Added AI Engineer @ Vdart Inc. (United States · Remote,
  Jun 2026 – Present) as the top entry — client described per resume
  convention as 'an enterprise healthcare client', no partner or
  end-client names
- Invision Global Tech closed out as Feb 2026 – Jun 2026
- Profile line now reads 'production ML and agentic AI systems';
  AI/LLM skills line adds multi-agent systems and Azure AI Search

Edited in place preserving the document's original formatting;
validated against the OOXML schema and content-verified via HTML
render (role order, dates, and absence of client names checked
programmatically).

Co-Authored-By: Claude Fable 5 <noreply@anthropic.com>
Claude-Session: https://claude.ai/code/session_01EdgodGrWsebbzGsV8vqZwF
</commit_message>
<xml_diff>
--- a/public/Rohit_Ananthan_Resume.docx
+++ b/public/Rohit_Ananthan_Resume.docx
@@ -96,7 +96,7 @@
           <w:sz w:val="18"/>
           <w:szCs w:val="18"/>
         </w:rPr>
-        <w:t xml:space="preserve">Data Scientist with 4+ years building production ML systems that generate measurable revenue and product impact. Proven ability to own the full lifecycle: problem framing, feature engineering, model development, A/B testing, deployment, and monitoring. Strong communicator who translates complex analyses into clear decisions for product and business stakeholders. Deep experience in Python, SQL, experimentation design, and cloud ML infrastructure (AWS, GCP). Most effective in fast-moving product or analytics teams where data directly shapes roadmap decisions.</w:t>
+        <w:t xml:space="preserve">Data Scientist with 4+ years building production ML and agentic AI systems that generate measurable revenue and product impact. Proven ability to own the full lifecycle: problem framing, feature engineering, model development, A/B testing, deployment, and monitoring. Strong communicator who translates complex analyses into clear decisions for product and business stakeholders. Deep experience in Python, SQL, experimentation design, and cloud ML infrastructure (AWS, GCP). Most effective in fast-moving product or analytics teams where data directly shapes roadmap decisions.</w:t>
       </w:r>
     </w:p>
     <w:p>
@@ -211,7 +211,7 @@
           <w:sz w:val="18"/>
           <w:szCs w:val="18"/>
         </w:rPr>
-        <w:t xml:space="preserve">RAG pipelines, LangChain, LlamaIndex, Gemini Pro, prompt engineering, embedding search, MLflow</w:t>
+        <w:t xml:space="preserve">RAG pipelines, multi-agent systems, LangChain, LlamaIndex, Azure AI Search, Gemini Pro, prompt engineering, MLflow</w:t>
       </w:r>
     </w:p>
     <w:p>
@@ -320,7 +320,7 @@
           <w:sz w:val="21"/>
           <w:szCs w:val="21"/>
         </w:rPr>
-        <w:t xml:space="preserve">Data Scientist Consultant</w:t>
+        <w:t xml:space="preserve">AI Engineer</w:t>
       </w:r>
       <w:r>
         <w:rPr>
@@ -339,7 +339,123 @@
           <w:sz w:val="18"/>
           <w:szCs w:val="18"/>
         </w:rPr>
-        <w:t xml:space="preserve">Feb 2026 – Present</w:t>
+        <w:t xml:space="preserve">Jun 2026 – Present</w:t>
+      </w:r>
+    </w:p>
+    <w:p>
+      <w:pPr>
+        <w:spacing w:before="0" w:after="38"/>
+      </w:pPr>
+      <w:r>
+        <w:rPr>
+          <w:rFonts w:ascii="Arial" w:cs="Arial" w:eastAsia="Arial" w:hAnsi="Arial"/>
+          <w:b/>
+          <w:bCs/>
+          <w:color w:val="1A5276"/>
+          <w:sz w:val="18"/>
+          <w:szCs w:val="18"/>
+        </w:rPr>
+        <w:t xml:space="preserve">Vdart Inc.</w:t>
+      </w:r>
+      <w:r>
+        <w:rPr>
+          <w:rFonts w:ascii="Arial" w:cs="Arial" w:eastAsia="Arial" w:hAnsi="Arial"/>
+          <w:color w:val="888888"/>
+          <w:sz w:val="17"/>
+          <w:szCs w:val="17"/>
+        </w:rPr>
+        <w:t xml:space="preserve">  ·  United States · Remote</w:t>
+      </w:r>
+    </w:p>
+    <w:p>
+      <w:pPr>
+        <w:pStyle w:val="ListParagraph"/>
+        <w:numPr>
+          <w:ilvl w:val="0"/>
+          <w:numId w:val="2"/>
+        </w:numPr>
+        <w:spacing w:before="32" w:after="32"/>
+      </w:pPr>
+      <w:r>
+        <w:rPr>
+          <w:rFonts w:ascii="Arial" w:cs="Arial" w:eastAsia="Arial" w:hAnsi="Arial"/>
+          <w:sz w:val="18"/>
+          <w:szCs w:val="18"/>
+        </w:rPr>
+        <w:t xml:space="preserve">Building a multi-agent AI pipeline that automates the full RFP lifecycle for an enterprise healthcare client — document intake and parsing, reviewer routing and assignment, automated QA review, and rules-based scoring — targeting an ~85% reduction in manual processing time.</w:t>
+      </w:r>
+    </w:p>
+    <w:p>
+      <w:pPr>
+        <w:pStyle w:val="ListParagraph"/>
+        <w:numPr>
+          <w:ilvl w:val="0"/>
+          <w:numId w:val="2"/>
+        </w:numPr>
+        <w:spacing w:before="32" w:after="32"/>
+      </w:pPr>
+      <w:r>
+        <w:rPr>
+          <w:rFonts w:ascii="Arial" w:cs="Arial" w:eastAsia="Arial" w:hAnsi="Arial"/>
+          <w:sz w:val="18"/>
+          <w:szCs w:val="18"/>
+        </w:rPr>
+        <w:t xml:space="preserve">Grounded the scoring engine with retrieval over an Azure AI Search vector index so evaluation criteria are pulled live at scoring time rather than hardcoded; MongoDB for persistence across the pipeline.</w:t>
+      </w:r>
+    </w:p>
+    <w:p>
+      <w:pPr>
+        <w:pStyle w:val="ListParagraph"/>
+        <w:numPr>
+          <w:ilvl w:val="0"/>
+          <w:numId w:val="2"/>
+        </w:numPr>
+        <w:spacing w:before="32" w:after="32"/>
+      </w:pPr>
+      <w:r>
+        <w:rPr>
+          <w:rFonts w:ascii="Arial" w:cs="Arial" w:eastAsia="Arial" w:hAnsi="Arial"/>
+          <w:sz w:val="18"/>
+          <w:szCs w:val="18"/>
+        </w:rPr>
+        <w:t xml:space="preserve">Delivering the React frontend and Node.js backend by orchestrating GitHub Copilot coding agents, including automated git commit workflows — AI-assisted engineering as a core delivery practice.</w:t>
+      </w:r>
+    </w:p>
+    <w:p>
+      <w:pPr>
+        <w:tabs>
+          <w:tab w:val="right" w:pos="10880"/>
+        </w:tabs>
+        <w:spacing w:before="100" w:after="0"/>
+      </w:pPr>
+      <w:r>
+        <w:rPr>
+          <w:rFonts w:ascii="Arial" w:cs="Arial" w:eastAsia="Arial" w:hAnsi="Arial"/>
+          <w:b/>
+          <w:bCs/>
+          <w:sz w:val="21"/>
+          <w:szCs w:val="21"/>
+        </w:rPr>
+        <w:t xml:space="preserve">Data Scientist Consultant</w:t>
+      </w:r>
+      <w:r>
+        <w:rPr>
+          <w:rFonts w:ascii="Arial" w:cs="Arial" w:eastAsia="Arial" w:hAnsi="Arial"/>
+          <w:sz w:val="18"/>
+          <w:szCs w:val="18"/>
+        </w:rPr>
+        <w:t xml:space="preserve">	</w:t>
+      </w:r>
+      <w:r>
+        <w:rPr>
+          <w:rFonts w:ascii="Arial" w:cs="Arial" w:eastAsia="Arial" w:hAnsi="Arial"/>
+          <w:i/>
+          <w:iCs/>
+          <w:color w:val="444444"/>
+          <w:sz w:val="18"/>
+          <w:szCs w:val="18"/>
+        </w:rPr>
+        <w:t xml:space="preserve">Feb 2026 – Jun 2026</w:t>
       </w:r>
     </w:p>
     <w:p>

</xml_diff>

<commit_message>
Update downloadable resume with current Vdart role (#8)
The resume served by the Download Resume button still listed Invision
as the current position. Updated:

- Added AI Engineer @ Vdart Inc. (United States · Remote,
  Jun 2026 – Present) as the top entry — client described per resume
  convention as 'an enterprise healthcare client', no partner or
  end-client names
- Invision Global Tech closed out as Feb 2026 – Jun 2026
- Profile line now reads 'production ML and agentic AI systems';
  AI/LLM skills line adds multi-agent systems and Azure AI Search

Edited in place preserving the document's original formatting;
validated against the OOXML schema and content-verified via HTML
render (role order, dates, and absence of client names checked
programmatically).


Claude-Session: https://claude.ai/code/session_01EdgodGrWsebbzGsV8vqZwF

Co-authored-by: Claude <noreply@anthropic.com>
</commit_message>
<xml_diff>
--- a/public/Rohit_Ananthan_Resume.docx
+++ b/public/Rohit_Ananthan_Resume.docx
@@ -96,7 +96,7 @@
           <w:sz w:val="18"/>
           <w:szCs w:val="18"/>
         </w:rPr>
-        <w:t xml:space="preserve">Data Scientist with 4+ years building production ML systems that generate measurable revenue and product impact. Proven ability to own the full lifecycle: problem framing, feature engineering, model development, A/B testing, deployment, and monitoring. Strong communicator who translates complex analyses into clear decisions for product and business stakeholders. Deep experience in Python, SQL, experimentation design, and cloud ML infrastructure (AWS, GCP). Most effective in fast-moving product or analytics teams where data directly shapes roadmap decisions.</w:t>
+        <w:t xml:space="preserve">Data Scientist with 4+ years building production ML and agentic AI systems that generate measurable revenue and product impact. Proven ability to own the full lifecycle: problem framing, feature engineering, model development, A/B testing, deployment, and monitoring. Strong communicator who translates complex analyses into clear decisions for product and business stakeholders. Deep experience in Python, SQL, experimentation design, and cloud ML infrastructure (AWS, GCP). Most effective in fast-moving product or analytics teams where data directly shapes roadmap decisions.</w:t>
       </w:r>
     </w:p>
     <w:p>
@@ -211,7 +211,7 @@
           <w:sz w:val="18"/>
           <w:szCs w:val="18"/>
         </w:rPr>
-        <w:t xml:space="preserve">RAG pipelines, LangChain, LlamaIndex, Gemini Pro, prompt engineering, embedding search, MLflow</w:t>
+        <w:t xml:space="preserve">RAG pipelines, multi-agent systems, LangChain, LlamaIndex, Azure AI Search, Gemini Pro, prompt engineering, MLflow</w:t>
       </w:r>
     </w:p>
     <w:p>
@@ -320,7 +320,7 @@
           <w:sz w:val="21"/>
           <w:szCs w:val="21"/>
         </w:rPr>
-        <w:t xml:space="preserve">Data Scientist Consultant</w:t>
+        <w:t xml:space="preserve">AI Engineer</w:t>
       </w:r>
       <w:r>
         <w:rPr>
@@ -339,7 +339,123 @@
           <w:sz w:val="18"/>
           <w:szCs w:val="18"/>
         </w:rPr>
-        <w:t xml:space="preserve">Feb 2026 – Present</w:t>
+        <w:t xml:space="preserve">Jun 2026 – Present</w:t>
+      </w:r>
+    </w:p>
+    <w:p>
+      <w:pPr>
+        <w:spacing w:before="0" w:after="38"/>
+      </w:pPr>
+      <w:r>
+        <w:rPr>
+          <w:rFonts w:ascii="Arial" w:cs="Arial" w:eastAsia="Arial" w:hAnsi="Arial"/>
+          <w:b/>
+          <w:bCs/>
+          <w:color w:val="1A5276"/>
+          <w:sz w:val="18"/>
+          <w:szCs w:val="18"/>
+        </w:rPr>
+        <w:t xml:space="preserve">Vdart Inc.</w:t>
+      </w:r>
+      <w:r>
+        <w:rPr>
+          <w:rFonts w:ascii="Arial" w:cs="Arial" w:eastAsia="Arial" w:hAnsi="Arial"/>
+          <w:color w:val="888888"/>
+          <w:sz w:val="17"/>
+          <w:szCs w:val="17"/>
+        </w:rPr>
+        <w:t xml:space="preserve">  ·  United States · Remote</w:t>
+      </w:r>
+    </w:p>
+    <w:p>
+      <w:pPr>
+        <w:pStyle w:val="ListParagraph"/>
+        <w:numPr>
+          <w:ilvl w:val="0"/>
+          <w:numId w:val="2"/>
+        </w:numPr>
+        <w:spacing w:before="32" w:after="32"/>
+      </w:pPr>
+      <w:r>
+        <w:rPr>
+          <w:rFonts w:ascii="Arial" w:cs="Arial" w:eastAsia="Arial" w:hAnsi="Arial"/>
+          <w:sz w:val="18"/>
+          <w:szCs w:val="18"/>
+        </w:rPr>
+        <w:t xml:space="preserve">Building a multi-agent AI pipeline that automates the full RFP lifecycle for an enterprise healthcare client — document intake and parsing, reviewer routing and assignment, automated QA review, and rules-based scoring — targeting an ~85% reduction in manual processing time.</w:t>
+      </w:r>
+    </w:p>
+    <w:p>
+      <w:pPr>
+        <w:pStyle w:val="ListParagraph"/>
+        <w:numPr>
+          <w:ilvl w:val="0"/>
+          <w:numId w:val="2"/>
+        </w:numPr>
+        <w:spacing w:before="32" w:after="32"/>
+      </w:pPr>
+      <w:r>
+        <w:rPr>
+          <w:rFonts w:ascii="Arial" w:cs="Arial" w:eastAsia="Arial" w:hAnsi="Arial"/>
+          <w:sz w:val="18"/>
+          <w:szCs w:val="18"/>
+        </w:rPr>
+        <w:t xml:space="preserve">Grounded the scoring engine with retrieval over an Azure AI Search vector index so evaluation criteria are pulled live at scoring time rather than hardcoded; MongoDB for persistence across the pipeline.</w:t>
+      </w:r>
+    </w:p>
+    <w:p>
+      <w:pPr>
+        <w:pStyle w:val="ListParagraph"/>
+        <w:numPr>
+          <w:ilvl w:val="0"/>
+          <w:numId w:val="2"/>
+        </w:numPr>
+        <w:spacing w:before="32" w:after="32"/>
+      </w:pPr>
+      <w:r>
+        <w:rPr>
+          <w:rFonts w:ascii="Arial" w:cs="Arial" w:eastAsia="Arial" w:hAnsi="Arial"/>
+          <w:sz w:val="18"/>
+          <w:szCs w:val="18"/>
+        </w:rPr>
+        <w:t xml:space="preserve">Delivering the React frontend and Node.js backend by orchestrating GitHub Copilot coding agents, including automated git commit workflows — AI-assisted engineering as a core delivery practice.</w:t>
+      </w:r>
+    </w:p>
+    <w:p>
+      <w:pPr>
+        <w:tabs>
+          <w:tab w:val="right" w:pos="10880"/>
+        </w:tabs>
+        <w:spacing w:before="100" w:after="0"/>
+      </w:pPr>
+      <w:r>
+        <w:rPr>
+          <w:rFonts w:ascii="Arial" w:cs="Arial" w:eastAsia="Arial" w:hAnsi="Arial"/>
+          <w:b/>
+          <w:bCs/>
+          <w:sz w:val="21"/>
+          <w:szCs w:val="21"/>
+        </w:rPr>
+        <w:t xml:space="preserve">Data Scientist Consultant</w:t>
+      </w:r>
+      <w:r>
+        <w:rPr>
+          <w:rFonts w:ascii="Arial" w:cs="Arial" w:eastAsia="Arial" w:hAnsi="Arial"/>
+          <w:sz w:val="18"/>
+          <w:szCs w:val="18"/>
+        </w:rPr>
+        <w:t xml:space="preserve">	</w:t>
+      </w:r>
+      <w:r>
+        <w:rPr>
+          <w:rFonts w:ascii="Arial" w:cs="Arial" w:eastAsia="Arial" w:hAnsi="Arial"/>
+          <w:i/>
+          <w:iCs/>
+          <w:color w:val="444444"/>
+          <w:sz w:val="18"/>
+          <w:szCs w:val="18"/>
+        </w:rPr>
+        <w:t xml:space="preserve">Feb 2026 – Jun 2026</w:t>
       </w:r>
     </w:p>
     <w:p>

</xml_diff>